<commit_message>
docs(forensic): add training-curves plot to REPORT (md + docx embedded)
New: phases/forensic/scripts/plot_training.py
  Reads training_history.csv, produces a 2-panel PNG showing:
    Top:    train_loss (red, log scale) + val_ap (blue) per epoch, with
            stars on best-epoch markers and the Phase 2 region shaded.
    Bottom: learning rate per epoch (log scale).
  Output: phases/forensic/outputs/training_curves.png (83 KB)

Updated: build_handoff_report.py
  - Embeds the PNG into REPORT.md if present, with a brief caption.
  - Passes --resource-path so pandoc/pypandoc resolves the relative image
    path correctly into the .docx.

Result: REPORT.docx grew from 16 KB to 97 KB (image embedded). The doctor
sees the training story at a glance: rapid loss drop in Phase 1, val AP
plateau around 0.978, sharp val AP jump to 0.984 at the Phase 2 transition,
then three ReduceLROnPlateau LR cuts before early-stop.
</commit_message>
<xml_diff>
--- a/phases/forensic/REPORT.docx
+++ b/phases/forensic/REPORT.docx
@@ -2,7 +2,7 @@
 <file path=word/document.xml><?xml version="1.0" encoding="utf-8"?>
 <w:document xmlns:w="http://schemas.openxmlformats.org/wordprocessingml/2006/main" xmlns:m="http://schemas.openxmlformats.org/officeDocument/2006/math" xmlns:r="http://schemas.openxmlformats.org/officeDocument/2006/relationships" xmlns:o="urn:schemas-microsoft-com:office:office" xmlns:v="urn:schemas-microsoft-com:vml" xmlns:w10="urn:schemas-microsoft-com:office:word" xmlns:a="http://schemas.openxmlformats.org/drawingml/2006/main" xmlns:pic="http://schemas.openxmlformats.org/drawingml/2006/picture" xmlns:wp="http://schemas.openxmlformats.org/drawingml/2006/wordprocessingDrawing">
   <w:body>
-    <w:bookmarkStart w:id="16" w:name="X626cffac92888c3a0571bcceba8aafae9f1e13a"/>
+    <w:bookmarkStart w:id="20" w:name="X626cffac92888c3a0571bcceba8aafae9f1e13a"/>
     <w:p>
       <w:pPr>
         <w:pStyle w:val="Heading1"/>
@@ -1454,7 +1454,7 @@
       </w:r>
     </w:p>
     <w:bookmarkEnd w:id="12"/>
-    <w:bookmarkStart w:id="14" w:name="training-results"/>
+    <w:bookmarkStart w:id="18" w:name="training-results"/>
     <w:p>
       <w:pPr>
         <w:pStyle w:val="Heading2"/>
@@ -1627,7 +1627,80 @@
         <w:t xml:space="preserve">(per spec F.22)</w:t>
       </w:r>
     </w:p>
-    <w:bookmarkStart w:id="13" w:name="training-history-per-epoch"/>
+    <w:bookmarkStart w:id="16" w:name="training-curves"/>
+    <w:p>
+      <w:pPr>
+        <w:pStyle w:val="Heading3"/>
+      </w:pPr>
+      <w:r>
+        <w:t xml:space="preserve">Training curves</w:t>
+      </w:r>
+    </w:p>
+    <w:p>
+      <w:pPr>
+        <w:pStyle w:val="CaptionedFigure"/>
+      </w:pPr>
+      <w:r>
+        <w:drawing>
+          <wp:inline>
+            <wp:extent cx="5334000" cy="3642183"/>
+            <wp:effectExtent b="0" l="0" r="0" t="0"/>
+            <wp:docPr descr="Training curves: train_loss + val_ap + lr per epoch" title="" id="14" name="Picture"/>
+            <a:graphic>
+              <a:graphicData uri="http://schemas.openxmlformats.org/drawingml/2006/picture">
+                <pic:pic>
+                  <pic:nvPicPr>
+                    <pic:cNvPr descr="outputs/training_curves.png" id="15" name="Picture"/>
+                    <pic:cNvPicPr>
+                      <a:picLocks noChangeArrowheads="1" noChangeAspect="1"/>
+                    </pic:cNvPicPr>
+                  </pic:nvPicPr>
+                  <pic:blipFill>
+                    <a:blip r:embed="rId13"/>
+                    <a:stretch>
+                      <a:fillRect/>
+                    </a:stretch>
+                  </pic:blipFill>
+                  <pic:spPr bwMode="auto">
+                    <a:xfrm>
+                      <a:off x="0" y="0"/>
+                      <a:ext cx="5334000" cy="3642183"/>
+                    </a:xfrm>
+                    <a:prstGeom prst="rect">
+                      <a:avLst/>
+                    </a:prstGeom>
+                    <a:noFill/>
+                    <a:ln w="9525">
+                      <a:noFill/>
+                      <a:headEnd/>
+                      <a:tailEnd/>
+                    </a:ln>
+                  </pic:spPr>
+                </pic:pic>
+              </a:graphicData>
+            </a:graphic>
+          </wp:inline>
+        </w:drawing>
+      </w:r>
+    </w:p>
+    <w:p>
+      <w:pPr>
+        <w:pStyle w:val="ImageCaption"/>
+      </w:pPr>
+      <w:r>
+        <w:t xml:space="preserve">Training curves: train_loss + val_ap + lr per epoch</w:t>
+      </w:r>
+    </w:p>
+    <w:p>
+      <w:pPr>
+        <w:pStyle w:val="BodyText"/>
+      </w:pPr>
+      <w:r>
+        <w:t xml:space="preserve">Stars mark new best val-AP epochs. Green shaded region = Phase 2 (epoch 6+, optimizer reinit, grad clip on). Bottom panel shows ReduceLROnPlateau cutting the LR three times.</w:t>
+      </w:r>
+    </w:p>
+    <w:bookmarkEnd w:id="16"/>
+    <w:bookmarkStart w:id="17" w:name="training-history-per-epoch"/>
     <w:p>
       <w:pPr>
         <w:pStyle w:val="Heading3"/>
@@ -3328,9 +3401,9 @@
         </w:tc>
       </w:tr>
     </w:tbl>
-    <w:bookmarkEnd w:id="13"/>
-    <w:bookmarkEnd w:id="14"/>
-    <w:bookmarkStart w:id="15" w:name="per-generator-evaluation"/>
+    <w:bookmarkEnd w:id="17"/>
+    <w:bookmarkEnd w:id="18"/>
+    <w:bookmarkStart w:id="19" w:name="per-generator-evaluation"/>
     <w:p>
       <w:pPr>
         <w:pStyle w:val="Heading2"/>
@@ -3347,9 +3420,9 @@
         <w:t xml:space="preserve">(Reproduces doctor’s F.25 table format; sklearn metrics; threshold 0.5 for accuracy.)</w:t>
       </w:r>
     </w:p>
-    <w:bookmarkEnd w:id="15"/>
-    <w:bookmarkEnd w:id="16"/>
-    <w:bookmarkStart w:id="20" w:name="Xe28a6b17292aa084fda3e690e594395ab7d5cc1"/>
+    <w:bookmarkEnd w:id="19"/>
+    <w:bookmarkEnd w:id="20"/>
+    <w:bookmarkStart w:id="24" w:name="Xe28a6b17292aa084fda3e690e594395ab7d5cc1"/>
     <w:p>
       <w:pPr>
         <w:pStyle w:val="Heading1"/>
@@ -4346,7 +4419,7 @@
         <w:t xml:space="preserve">, Diffusion-avg AP = 0.9836, GAN-avg AP = 0.9998, StdDev AP = 0.0158.</w:t>
       </w:r>
     </w:p>
-    <w:bookmarkStart w:id="17" w:name="discussion"/>
+    <w:bookmarkStart w:id="21" w:name="discussion"/>
     <w:p>
       <w:pPr>
         <w:pStyle w:val="Heading2"/>
@@ -4435,8 +4508,8 @@
         <w:t xml:space="preserve">becomes available.</w:t>
       </w:r>
     </w:p>
-    <w:bookmarkEnd w:id="17"/>
-    <w:bookmarkStart w:id="18" w:name="reproducibility"/>
+    <w:bookmarkEnd w:id="21"/>
+    <w:bookmarkStart w:id="22" w:name="reproducibility"/>
     <w:p>
       <w:pPr>
         <w:pStyle w:val="Heading2"/>
@@ -4756,7 +4829,7 @@
         <w:rPr>
           <w:rStyle w:val="CommentTok"/>
         </w:rPr>
-        <w:t xml:space="preserve"># 7. Build this report</w:t>
+        <w:t xml:space="preserve"># 7. (optional) Plot training curves</w:t>
       </w:r>
       <w:r>
         <w:br/>
@@ -4771,11 +4844,38 @@
         <w:rPr>
           <w:rStyle w:val="NormalTok"/>
         </w:rPr>
+        <w:t xml:space="preserve"> phases/forensic/scripts/plot_training.py</w:t>
+      </w:r>
+      <w:r>
+        <w:br/>
+      </w:r>
+      <w:r>
+        <w:br/>
+      </w:r>
+      <w:r>
+        <w:rPr>
+          <w:rStyle w:val="CommentTok"/>
+        </w:rPr>
+        <w:t xml:space="preserve"># 8. Build this report</w:t>
+      </w:r>
+      <w:r>
+        <w:br/>
+      </w:r>
+      <w:r>
+        <w:rPr>
+          <w:rStyle w:val="ExtensionTok"/>
+        </w:rPr>
+        <w:t xml:space="preserve">python</w:t>
+      </w:r>
+      <w:r>
+        <w:rPr>
+          <w:rStyle w:val="NormalTok"/>
+        </w:rPr>
         <w:t xml:space="preserve"> phases/forensic/scripts/build_handoff_report.py</w:t>
       </w:r>
     </w:p>
-    <w:bookmarkEnd w:id="18"/>
-    <w:bookmarkStart w:id="19" w:name="open-items"/>
+    <w:bookmarkEnd w:id="22"/>
+    <w:bookmarkStart w:id="23" w:name="open-items"/>
     <w:p>
       <w:pPr>
         <w:pStyle w:val="Heading2"/>
@@ -5021,8 +5121,8 @@
         <w:t xml:space="preserve">from on-disk artifacts.</w:t>
       </w:r>
     </w:p>
-    <w:bookmarkEnd w:id="19"/>
-    <w:bookmarkEnd w:id="20"/>
+    <w:bookmarkEnd w:id="23"/>
+    <w:bookmarkEnd w:id="24"/>
     <w:sectPr>
       <w:footnotePr>
         <w:numRestart w:val="eachSect"/>

</xml_diff>